<commit_message>
add submitted version to ecology letters here
</commit_message>
<xml_diff>
--- a/drafts/ecologyLetters_submission/CNPmeta_coverLetter_v1.0.docx
+++ b/drafts/ecologyLetters_submission/CNPmeta_coverLetter_v1.0.docx
@@ -46,10 +46,7 @@
     </w:p>
     <w:p>
       <w:r>
-        <w:rPr>
-          <w:highlight w:val="yellow"/>
-        </w:rPr>
-        <w:t>[date]</w:t>
+        <w:t>October 5, 2026</w:t>
       </w:r>
     </w:p>
     <w:p>
@@ -159,7 +156,10 @@
         <w:t>y</w:t>
       </w:r>
       <w:r>
-        <w:t xml:space="preserve"> these interactions for only a few whole-plant traits relevant for terrestrial biosphere modeling, restricting their ability to provide an empirical and theoretical basis for improving model performance and reliability. To address this gap, we compiled 5,680 observations from 90 full-factorial N-by-P supply experiments worldwide. We used this dataset to quantify the individual and interactive effects of N and P </w:t>
+        <w:t xml:space="preserve"> these interactions for only a few whole-plant traits relevant for terrestrial biosphere modeling, restricting their ability to provide an empirical and theoretical basis for improving model performance and reliability.</w:t>
+      </w:r>
+      <w:r>
+        <w:t xml:space="preserve"> To address this gap, we compiled 5,680 observations from 90 full-factorial N-by-P supply experiments worldwide. We used this dataset to quantify the individual and interactive effects of N and P </w:t>
       </w:r>
       <w:r>
         <w:t>supply</w:t>
@@ -867,6 +867,1117 @@
           <w14:ligatures w14:val="none"/>
         </w:rPr>
         <w:t>: 49–68.</w:t>
+      </w:r>
+    </w:p>
+    <w:p>
+      <w:pPr>
+        <w:rPr>
+          <w:rFonts w:eastAsia="Times New Roman"/>
+          <w:kern w:val="0"/>
+          <w14:ligatures w14:val="none"/>
+        </w:rPr>
+      </w:pPr>
+      <w:r>
+        <w:rPr>
+          <w:rFonts w:eastAsia="Times New Roman"/>
+          <w:kern w:val="0"/>
+          <w14:ligatures w14:val="none"/>
+        </w:rPr>
+        <w:br w:type="page"/>
+      </w:r>
+    </w:p>
+    <w:p>
+      <w:pPr>
+        <w:spacing w:after="0" w:line="360" w:lineRule="auto"/>
+        <w:rPr>
+          <w:i/>
+          <w:iCs/>
+        </w:rPr>
+      </w:pPr>
+      <w:r>
+        <w:rPr>
+          <w:b/>
+          <w:bCs/>
+        </w:rPr>
+        <w:lastRenderedPageBreak/>
+        <w:t>A synthesis of theoretical understanding and empirical evidence for plant responses to nitrogen and phosphorus supply</w:t>
+      </w:r>
+      <w:r>
+        <w:rPr>
+          <w:i/>
+          <w:iCs/>
+        </w:rPr>
+        <w:t xml:space="preserve"> </w:t>
+      </w:r>
+    </w:p>
+    <w:p>
+      <w:pPr>
+        <w:spacing w:after="0" w:line="360" w:lineRule="auto"/>
+        <w:rPr>
+          <w:i/>
+          <w:iCs/>
+        </w:rPr>
+      </w:pPr>
+      <w:r>
+        <w:rPr>
+          <w:i/>
+          <w:iCs/>
+        </w:rPr>
+        <w:t xml:space="preserve">Running </w:t>
+      </w:r>
+      <w:r>
+        <w:rPr>
+          <w:i/>
+          <w:iCs/>
+        </w:rPr>
+        <w:t>head: Plant responses to N, P, and N+P addition</w:t>
+      </w:r>
+    </w:p>
+    <w:p>
+      <w:pPr>
+        <w:spacing w:after="0" w:line="360" w:lineRule="auto"/>
+      </w:pPr>
+    </w:p>
+    <w:p>
+      <w:pPr>
+        <w:spacing w:after="0" w:line="360" w:lineRule="auto"/>
+        <w:rPr>
+          <w:b/>
+          <w:bCs/>
+        </w:rPr>
+      </w:pPr>
+      <w:r>
+        <w:t>Evan A. Perkowski</w:t>
+      </w:r>
+      <w:proofErr w:type="gramStart"/>
+      <w:r>
+        <w:rPr>
+          <w:vertAlign w:val="superscript"/>
+        </w:rPr>
+        <w:t>1,*</w:t>
+      </w:r>
+      <w:proofErr w:type="gramEnd"/>
+      <w:r>
+        <w:t xml:space="preserve">, </w:t>
+      </w:r>
+      <w:proofErr w:type="spellStart"/>
+      <w:r>
+        <w:t>Alissar</w:t>
+      </w:r>
+      <w:proofErr w:type="spellEnd"/>
+      <w:r>
+        <w:t xml:space="preserve"> Cheaib</w:t>
+      </w:r>
+      <w:r>
+        <w:rPr>
+          <w:vertAlign w:val="superscript"/>
+        </w:rPr>
+        <w:t>1</w:t>
+      </w:r>
+      <w:r>
+        <w:rPr>
+          <w:vertAlign w:val="superscript"/>
+        </w:rPr>
+        <w:t>,2</w:t>
+      </w:r>
+      <w:r>
+        <w:t>, Monika R. Kelley</w:t>
+      </w:r>
+      <w:r>
+        <w:rPr>
+          <w:vertAlign w:val="superscript"/>
+        </w:rPr>
+        <w:t>1</w:t>
+      </w:r>
+      <w:r>
+        <w:t>, Jan A. Lankhorst</w:t>
+      </w:r>
+      <w:r>
+        <w:rPr>
+          <w:vertAlign w:val="superscript"/>
+        </w:rPr>
+        <w:t>3</w:t>
+      </w:r>
+      <w:r>
+        <w:t>, Astrid Odé</w:t>
+      </w:r>
+      <w:r>
+        <w:rPr>
+          <w:vertAlign w:val="superscript"/>
+        </w:rPr>
+        <w:t>3</w:t>
+      </w:r>
+      <w:r>
+        <w:t>, Daniil J. P. Scheifes</w:t>
+      </w:r>
+      <w:r>
+        <w:rPr>
+          <w:vertAlign w:val="superscript"/>
+        </w:rPr>
+        <w:t>3</w:t>
+      </w:r>
+      <w:r>
+        <w:t>, Huiying Xu</w:t>
+      </w:r>
+      <w:r>
+        <w:rPr>
+          <w:vertAlign w:val="superscript"/>
+        </w:rPr>
+        <w:t>4</w:t>
+      </w:r>
+      <w:r>
+        <w:t>, Daisy Cárate-Tandalla</w:t>
+      </w:r>
+      <w:r>
+        <w:rPr>
+          <w:vertAlign w:val="superscript"/>
+        </w:rPr>
+        <w:t>5</w:t>
+      </w:r>
+      <w:r>
+        <w:t>, Hugo J. de Boer</w:t>
+      </w:r>
+      <w:r>
+        <w:rPr>
+          <w:vertAlign w:val="superscript"/>
+        </w:rPr>
+        <w:t>3</w:t>
+      </w:r>
+      <w:r>
+        <w:t>, Ning Dong</w:t>
+      </w:r>
+      <w:r>
+        <w:rPr>
+          <w:vertAlign w:val="superscript"/>
+        </w:rPr>
+        <w:t>6</w:t>
+      </w:r>
+      <w:r>
+        <w:rPr>
+          <w:vertAlign w:val="superscript"/>
+        </w:rPr>
+        <w:t>,7</w:t>
+      </w:r>
+      <w:r>
+        <w:t>, Benjamin D. Stocker</w:t>
+      </w:r>
+      <w:r>
+        <w:rPr>
+          <w:vertAlign w:val="superscript"/>
+        </w:rPr>
+        <w:t>8</w:t>
+      </w:r>
+      <w:r>
+        <w:rPr>
+          <w:vertAlign w:val="superscript"/>
+        </w:rPr>
+        <w:t>,9</w:t>
+      </w:r>
+      <w:r>
+        <w:t>, Karin T. Rebel</w:t>
+      </w:r>
+      <w:r>
+        <w:rPr>
+          <w:vertAlign w:val="superscript"/>
+        </w:rPr>
+        <w:t>3</w:t>
+      </w:r>
+      <w:r>
+        <w:t>, I. Colin Prentice</w:t>
+      </w:r>
+      <w:r>
+        <w:rPr>
+          <w:vertAlign w:val="superscript"/>
+        </w:rPr>
+        <w:t>6</w:t>
+      </w:r>
+      <w:r>
+        <w:rPr>
+          <w:vertAlign w:val="superscript"/>
+        </w:rPr>
+        <w:t>,</w:t>
+      </w:r>
+      <w:r>
+        <w:rPr>
+          <w:vertAlign w:val="superscript"/>
+        </w:rPr>
+        <w:t>10</w:t>
+      </w:r>
+      <w:r>
+        <w:t>, Sandy P. Harrison</w:t>
+      </w:r>
+      <w:r>
+        <w:rPr>
+          <w:vertAlign w:val="superscript"/>
+        </w:rPr>
+        <w:t>10</w:t>
+      </w:r>
+      <w:r>
+        <w:rPr>
+          <w:vertAlign w:val="superscript"/>
+        </w:rPr>
+        <w:t>,11</w:t>
+      </w:r>
+      <w:r>
+        <w:t>, Nicholas G. Smith</w:t>
+      </w:r>
+      <w:r>
+        <w:rPr>
+          <w:vertAlign w:val="superscript"/>
+        </w:rPr>
+        <w:t>1</w:t>
+      </w:r>
+      <w:r>
+        <w:rPr>
+          <w:vertAlign w:val="superscript"/>
+        </w:rPr>
+        <w:t>,12</w:t>
+      </w:r>
+    </w:p>
+    <w:p>
+      <w:pPr>
+        <w:spacing w:after="0" w:line="360" w:lineRule="auto"/>
+        <w:rPr>
+          <w:b/>
+          <w:bCs/>
+        </w:rPr>
+      </w:pPr>
+    </w:p>
+    <w:p>
+      <w:pPr>
+        <w:spacing w:after="0" w:line="360" w:lineRule="auto"/>
+      </w:pPr>
+      <w:r>
+        <w:rPr>
+          <w:vertAlign w:val="superscript"/>
+        </w:rPr>
+        <w:t>1</w:t>
+      </w:r>
+      <w:r>
+        <w:t>Department of Biological Sciences, Texas Tech University, Lubbock, TX, USA</w:t>
+      </w:r>
+    </w:p>
+    <w:p>
+      <w:pPr>
+        <w:spacing w:after="0" w:line="360" w:lineRule="auto"/>
+      </w:pPr>
+      <w:r>
+        <w:rPr>
+          <w:vertAlign w:val="superscript"/>
+        </w:rPr>
+        <w:t>2</w:t>
+      </w:r>
+      <w:r>
+        <w:t xml:space="preserve">Institut </w:t>
+      </w:r>
+      <w:proofErr w:type="spellStart"/>
+      <w:r>
+        <w:t>Méditerranéen</w:t>
+      </w:r>
+      <w:proofErr w:type="spellEnd"/>
+      <w:r>
+        <w:t xml:space="preserve"> de </w:t>
+      </w:r>
+      <w:proofErr w:type="spellStart"/>
+      <w:r>
+        <w:t>Biodiversité</w:t>
+      </w:r>
+      <w:proofErr w:type="spellEnd"/>
+      <w:r>
+        <w:t xml:space="preserve"> et </w:t>
+      </w:r>
+      <w:proofErr w:type="spellStart"/>
+      <w:r>
+        <w:t>d’Ecologie</w:t>
+      </w:r>
+      <w:proofErr w:type="spellEnd"/>
+      <w:r>
+        <w:t xml:space="preserve"> marine et </w:t>
+      </w:r>
+      <w:proofErr w:type="spellStart"/>
+      <w:r>
+        <w:t>continentale</w:t>
+      </w:r>
+      <w:proofErr w:type="spellEnd"/>
+      <w:r>
+        <w:t xml:space="preserve"> (IMBE) – Aix Marseille Université, Marseille, FR</w:t>
+      </w:r>
+    </w:p>
+    <w:p>
+      <w:pPr>
+        <w:spacing w:after="0" w:line="360" w:lineRule="auto"/>
+      </w:pPr>
+      <w:r>
+        <w:rPr>
+          <w:vertAlign w:val="superscript"/>
+        </w:rPr>
+        <w:t>3</w:t>
+      </w:r>
+      <w:r>
+        <w:t>Copernicus Institute of Sustainable Development, Environmental Sciences, Faculty of Geosciences, Utrecht University, NL</w:t>
+      </w:r>
+    </w:p>
+    <w:p>
+      <w:pPr>
+        <w:spacing w:after="0" w:line="360" w:lineRule="auto"/>
+      </w:pPr>
+      <w:r>
+        <w:rPr>
+          <w:vertAlign w:val="superscript"/>
+        </w:rPr>
+        <w:t>4</w:t>
+      </w:r>
+      <w:r>
+        <w:t>School of Biological Sciences, University of Utah, Salt Lake City, UT, USA</w:t>
+      </w:r>
+    </w:p>
+    <w:p>
+      <w:pPr>
+        <w:spacing w:after="0" w:line="360" w:lineRule="auto"/>
+      </w:pPr>
+      <w:r>
+        <w:rPr>
+          <w:vertAlign w:val="superscript"/>
+        </w:rPr>
+        <w:t>5</w:t>
+      </w:r>
+      <w:r>
+        <w:t xml:space="preserve">iES Landau, Institute for Environmental Science, RPTU Kaiserslautern - Landau, </w:t>
+      </w:r>
+      <w:proofErr w:type="spellStart"/>
+      <w:r>
+        <w:t>Fortstrasse</w:t>
+      </w:r>
+      <w:proofErr w:type="spellEnd"/>
+      <w:r>
+        <w:t xml:space="preserve"> 7, 76829 Landau, Germany</w:t>
+      </w:r>
+    </w:p>
+    <w:p>
+      <w:pPr>
+        <w:spacing w:after="0" w:line="360" w:lineRule="auto"/>
+      </w:pPr>
+      <w:r>
+        <w:rPr>
+          <w:vertAlign w:val="superscript"/>
+        </w:rPr>
+        <w:t>6</w:t>
+      </w:r>
+      <w:r>
+        <w:t xml:space="preserve">Department of Life Sciences, Georgina Mace Centre for the Living Planet, Imperial College London, </w:t>
+      </w:r>
+      <w:proofErr w:type="spellStart"/>
+      <w:r>
+        <w:t>Silwood</w:t>
+      </w:r>
+      <w:proofErr w:type="spellEnd"/>
+      <w:r>
+        <w:t xml:space="preserve"> Park Campus, Ascot, UK</w:t>
+      </w:r>
+    </w:p>
+    <w:p>
+      <w:pPr>
+        <w:spacing w:after="0" w:line="360" w:lineRule="auto"/>
+      </w:pPr>
+      <w:r>
+        <w:rPr>
+          <w:vertAlign w:val="superscript"/>
+        </w:rPr>
+        <w:t>7</w:t>
+      </w:r>
+      <w:r>
+        <w:t>College of Resources and Environment, Huazhong Agricultural University, Wuhan, 430070, China</w:t>
+      </w:r>
+    </w:p>
+    <w:p>
+      <w:pPr>
+        <w:spacing w:after="0" w:line="360" w:lineRule="auto"/>
+      </w:pPr>
+      <w:r>
+        <w:rPr>
+          <w:vertAlign w:val="superscript"/>
+        </w:rPr>
+        <w:t>8</w:t>
+      </w:r>
+      <w:r>
+        <w:t xml:space="preserve">Institute of Geography, University of Bern, </w:t>
+      </w:r>
+      <w:proofErr w:type="spellStart"/>
+      <w:r>
+        <w:t>Hallerstrasse</w:t>
+      </w:r>
+      <w:proofErr w:type="spellEnd"/>
+      <w:r>
+        <w:t xml:space="preserve"> 12, 3012 Bern, Switzerland</w:t>
+      </w:r>
+    </w:p>
+    <w:p>
+      <w:pPr>
+        <w:spacing w:after="0" w:line="360" w:lineRule="auto"/>
+      </w:pPr>
+      <w:r>
+        <w:rPr>
+          <w:vertAlign w:val="superscript"/>
+        </w:rPr>
+        <w:t>9</w:t>
+      </w:r>
+      <w:r>
+        <w:t xml:space="preserve">Oeschger Centre for Climate Change Research, University of Bern, </w:t>
+      </w:r>
+      <w:proofErr w:type="spellStart"/>
+      <w:r>
+        <w:t>Falkenplatz</w:t>
+      </w:r>
+      <w:proofErr w:type="spellEnd"/>
+      <w:r>
+        <w:t xml:space="preserve"> 16, 3012 Bern, Switzerland</w:t>
+      </w:r>
+    </w:p>
+    <w:p>
+      <w:pPr>
+        <w:spacing w:after="0" w:line="360" w:lineRule="auto"/>
+      </w:pPr>
+      <w:r>
+        <w:rPr>
+          <w:vertAlign w:val="superscript"/>
+        </w:rPr>
+        <w:t>10</w:t>
+      </w:r>
+      <w:r>
+        <w:t>Department of Earth System Science, Ministry of Education Key Laboratory for Earth System Modeling, Institute for Global Change Studies, Tsinghua University, Beijing, China</w:t>
+      </w:r>
+    </w:p>
+    <w:p>
+      <w:pPr>
+        <w:spacing w:after="0" w:line="360" w:lineRule="auto"/>
+      </w:pPr>
+      <w:r>
+        <w:rPr>
+          <w:vertAlign w:val="superscript"/>
+        </w:rPr>
+        <w:t>1</w:t>
+      </w:r>
+      <w:r>
+        <w:rPr>
+          <w:vertAlign w:val="superscript"/>
+        </w:rPr>
+        <w:t>1</w:t>
+      </w:r>
+      <w:r>
+        <w:t>Department of Geography and Environmental Science, University of Reading, Reading, UK</w:t>
+      </w:r>
+    </w:p>
+    <w:p>
+      <w:pPr>
+        <w:spacing w:after="0" w:line="360" w:lineRule="auto"/>
+      </w:pPr>
+      <w:r>
+        <w:rPr>
+          <w:vertAlign w:val="superscript"/>
+        </w:rPr>
+        <w:t>12</w:t>
+      </w:r>
+      <w:r>
+        <w:t>School of Biological Sciences, University of Nebraska – Lincoln, Lincoln, NE, USA</w:t>
+      </w:r>
+    </w:p>
+    <w:p>
+      <w:pPr>
+        <w:spacing w:after="0" w:line="360" w:lineRule="auto"/>
+      </w:pPr>
+    </w:p>
+    <w:p>
+      <w:pPr>
+        <w:spacing w:after="0" w:line="360" w:lineRule="auto"/>
+      </w:pPr>
+    </w:p>
+    <w:p>
+      <w:pPr>
+        <w:spacing w:after="0" w:line="360" w:lineRule="auto"/>
+      </w:pPr>
+    </w:p>
+    <w:p>
+      <w:pPr>
+        <w:spacing w:after="0" w:line="360" w:lineRule="auto"/>
+      </w:pPr>
+      <w:r>
+        <w:rPr>
+          <w:vertAlign w:val="superscript"/>
+        </w:rPr>
+        <w:lastRenderedPageBreak/>
+        <w:t>*</w:t>
+      </w:r>
+      <w:r>
+        <w:t>Correspondence to:</w:t>
+      </w:r>
+    </w:p>
+    <w:p>
+      <w:pPr>
+        <w:spacing w:after="0" w:line="360" w:lineRule="auto"/>
+      </w:pPr>
+      <w:r>
+        <w:t>Evan A. Perkowski</w:t>
+      </w:r>
+    </w:p>
+    <w:p>
+      <w:pPr>
+        <w:spacing w:after="0" w:line="360" w:lineRule="auto"/>
+      </w:pPr>
+      <w:r>
+        <w:t>2901 Main St</w:t>
+      </w:r>
+      <w:r>
+        <w:t>.</w:t>
+      </w:r>
+    </w:p>
+    <w:p>
+      <w:pPr>
+        <w:spacing w:after="0" w:line="360" w:lineRule="auto"/>
+      </w:pPr>
+      <w:r>
+        <w:t>Lubbock, TX 79409</w:t>
+      </w:r>
+    </w:p>
+    <w:p>
+      <w:pPr>
+        <w:spacing w:after="0" w:line="360" w:lineRule="auto"/>
+      </w:pPr>
+      <w:hyperlink r:id="rId6">
+        <w:r>
+          <w:rPr>
+            <w:color w:val="1155CC"/>
+            <w:u w:val="single"/>
+          </w:rPr>
+          <w:t>evan.a.perkowski@ttu.edu</w:t>
+        </w:r>
+      </w:hyperlink>
+    </w:p>
+    <w:p>
+      <w:pPr>
+        <w:spacing w:after="0" w:line="360" w:lineRule="auto"/>
+        <w:rPr>
+          <w:b/>
+          <w:bCs/>
+        </w:rPr>
+      </w:pPr>
+    </w:p>
+    <w:p>
+      <w:pPr>
+        <w:spacing w:after="0" w:line="360" w:lineRule="auto"/>
+        <w:rPr>
+          <w:b/>
+          <w:bCs/>
+        </w:rPr>
+      </w:pPr>
+      <w:r>
+        <w:rPr>
+          <w:b/>
+          <w:bCs/>
+        </w:rPr>
+        <w:t>ORCID</w:t>
+      </w:r>
+    </w:p>
+    <w:p>
+      <w:pPr>
+        <w:spacing w:after="0" w:line="360" w:lineRule="auto"/>
+      </w:pPr>
+      <w:r>
+        <w:t>Evan A. Perkowski (</w:t>
+      </w:r>
+      <w:r>
+        <w:t>0000-0002-9523-8892</w:t>
+      </w:r>
+      <w:r>
+        <w:t>)</w:t>
+      </w:r>
+    </w:p>
+    <w:p>
+      <w:pPr>
+        <w:spacing w:after="0" w:line="360" w:lineRule="auto"/>
+      </w:pPr>
+      <w:proofErr w:type="spellStart"/>
+      <w:r>
+        <w:t>Alissar</w:t>
+      </w:r>
+      <w:proofErr w:type="spellEnd"/>
+      <w:r>
+        <w:t xml:space="preserve"> Cheaib</w:t>
+      </w:r>
+      <w:r>
+        <w:rPr>
+          <w:vertAlign w:val="superscript"/>
+        </w:rPr>
+        <w:t xml:space="preserve"> </w:t>
+      </w:r>
+      <w:r>
+        <w:t>(</w:t>
+      </w:r>
+      <w:r>
+        <w:t>0009-0004-4481-7976</w:t>
+      </w:r>
+      <w:r>
+        <w:t>)</w:t>
+      </w:r>
+    </w:p>
+    <w:p>
+      <w:pPr>
+        <w:spacing w:after="0" w:line="360" w:lineRule="auto"/>
+      </w:pPr>
+      <w:r>
+        <w:t>Monika R. Kelley</w:t>
+      </w:r>
+      <w:r>
+        <w:t xml:space="preserve"> (</w:t>
+      </w:r>
+      <w:r>
+        <w:t>0000-0003-0674-5356</w:t>
+      </w:r>
+      <w:r>
+        <w:t>)</w:t>
+      </w:r>
+    </w:p>
+    <w:p>
+      <w:pPr>
+        <w:spacing w:after="0" w:line="360" w:lineRule="auto"/>
+      </w:pPr>
+      <w:r>
+        <w:t xml:space="preserve">Jan A. </w:t>
+      </w:r>
+      <w:proofErr w:type="spellStart"/>
+      <w:r>
+        <w:t>Lankhorst</w:t>
+      </w:r>
+      <w:proofErr w:type="spellEnd"/>
+      <w:r>
+        <w:t xml:space="preserve"> (</w:t>
+      </w:r>
+      <w:r>
+        <w:t>0000-0001-9119-3757</w:t>
+      </w:r>
+      <w:r>
+        <w:t>)</w:t>
+      </w:r>
+    </w:p>
+    <w:p>
+      <w:pPr>
+        <w:spacing w:after="0" w:line="360" w:lineRule="auto"/>
+      </w:pPr>
+      <w:r>
+        <w:t xml:space="preserve">Astrid </w:t>
+      </w:r>
+      <w:proofErr w:type="spellStart"/>
+      <w:r>
+        <w:t>Odé</w:t>
+      </w:r>
+      <w:proofErr w:type="spellEnd"/>
+      <w:r>
+        <w:t xml:space="preserve"> (</w:t>
+      </w:r>
+      <w:r>
+        <w:t>0000-0002-0672-9535</w:t>
+      </w:r>
+      <w:r>
+        <w:t>)</w:t>
+      </w:r>
+    </w:p>
+    <w:p>
+      <w:pPr>
+        <w:spacing w:after="0" w:line="360" w:lineRule="auto"/>
+      </w:pPr>
+      <w:r>
+        <w:t xml:space="preserve">Daniil J. P. </w:t>
+      </w:r>
+      <w:proofErr w:type="spellStart"/>
+      <w:r>
+        <w:t>Scheifes</w:t>
+      </w:r>
+      <w:proofErr w:type="spellEnd"/>
+      <w:r>
+        <w:t xml:space="preserve"> (</w:t>
+      </w:r>
+      <w:r>
+        <w:t>0000-0002-7746-1062</w:t>
+      </w:r>
+      <w:r>
+        <w:t>)</w:t>
+      </w:r>
+    </w:p>
+    <w:p>
+      <w:pPr>
+        <w:spacing w:after="0" w:line="360" w:lineRule="auto"/>
+      </w:pPr>
+      <w:r>
+        <w:t>Huiying Xu</w:t>
+      </w:r>
+      <w:r>
+        <w:t xml:space="preserve"> (</w:t>
+      </w:r>
+      <w:r>
+        <w:t>0000-0003-3902-9620</w:t>
+      </w:r>
+      <w:r>
+        <w:t>)</w:t>
+      </w:r>
+    </w:p>
+    <w:p>
+      <w:pPr>
+        <w:spacing w:after="0" w:line="360" w:lineRule="auto"/>
+      </w:pPr>
+      <w:r>
+        <w:t>Daisy Cárate-Tandalla</w:t>
+      </w:r>
+      <w:r>
+        <w:t xml:space="preserve"> (</w:t>
+      </w:r>
+      <w:r>
+        <w:t>0000-0003-2990-1454</w:t>
+      </w:r>
+      <w:r>
+        <w:t>)</w:t>
+      </w:r>
+    </w:p>
+    <w:p>
+      <w:pPr>
+        <w:spacing w:after="0" w:line="360" w:lineRule="auto"/>
+      </w:pPr>
+      <w:r>
+        <w:t>Hugo J. de Boer</w:t>
+      </w:r>
+      <w:r>
+        <w:t xml:space="preserve"> (</w:t>
+      </w:r>
+      <w:r>
+        <w:t>0000-0002-6933-344X</w:t>
+      </w:r>
+      <w:r>
+        <w:t>)</w:t>
+      </w:r>
+    </w:p>
+    <w:p>
+      <w:pPr>
+        <w:spacing w:after="0" w:line="360" w:lineRule="auto"/>
+      </w:pPr>
+      <w:r>
+        <w:t>Ning Dong</w:t>
+      </w:r>
+      <w:r>
+        <w:t xml:space="preserve"> (</w:t>
+      </w:r>
+      <w:r>
+        <w:t>0000-0003-0793-8854</w:t>
+      </w:r>
+      <w:r>
+        <w:t>)</w:t>
+      </w:r>
+    </w:p>
+    <w:p>
+      <w:pPr>
+        <w:spacing w:after="0" w:line="360" w:lineRule="auto"/>
+      </w:pPr>
+      <w:r>
+        <w:t>Benjamin D. Stocker</w:t>
+      </w:r>
+      <w:r>
+        <w:t xml:space="preserve"> (</w:t>
+      </w:r>
+      <w:r>
+        <w:t>0000-0003-2697-9096</w:t>
+      </w:r>
+      <w:r>
+        <w:t>)</w:t>
+      </w:r>
+    </w:p>
+    <w:p>
+      <w:pPr>
+        <w:spacing w:after="0" w:line="360" w:lineRule="auto"/>
+      </w:pPr>
+      <w:r>
+        <w:t>Karin T. Rebel</w:t>
+      </w:r>
+      <w:r>
+        <w:t xml:space="preserve"> (</w:t>
+      </w:r>
+      <w:r>
+        <w:t>0000-0002-1722-3935</w:t>
+      </w:r>
+      <w:r>
+        <w:t>)</w:t>
+      </w:r>
+    </w:p>
+    <w:p>
+      <w:pPr>
+        <w:spacing w:after="0" w:line="360" w:lineRule="auto"/>
+      </w:pPr>
+      <w:r>
+        <w:t>I. Colin Prentice</w:t>
+      </w:r>
+      <w:r>
+        <w:t xml:space="preserve"> (</w:t>
+      </w:r>
+      <w:r>
+        <w:t>0000-0002-1296-6764</w:t>
+      </w:r>
+      <w:r>
+        <w:t>)</w:t>
+      </w:r>
+    </w:p>
+    <w:p>
+      <w:pPr>
+        <w:spacing w:after="0" w:line="360" w:lineRule="auto"/>
+      </w:pPr>
+      <w:r>
+        <w:t>Sandy P. Harrison</w:t>
+      </w:r>
+      <w:r>
+        <w:t xml:space="preserve"> (</w:t>
+      </w:r>
+      <w:r>
+        <w:t>0000-0001-5687-1903</w:t>
+      </w:r>
+      <w:r>
+        <w:t>)</w:t>
+      </w:r>
+    </w:p>
+    <w:p>
+      <w:pPr>
+        <w:spacing w:after="0" w:line="360" w:lineRule="auto"/>
+      </w:pPr>
+      <w:r>
+        <w:t>Nicholas G. Smith</w:t>
+      </w:r>
+      <w:r>
+        <w:t xml:space="preserve"> (</w:t>
+      </w:r>
+      <w:r>
+        <w:t>0000-0001-7048-4387</w:t>
+      </w:r>
+      <w:r>
+        <w:t>)</w:t>
+      </w:r>
+    </w:p>
+    <w:p>
+      <w:pPr>
+        <w:spacing w:after="0" w:line="360" w:lineRule="auto"/>
+      </w:pPr>
+    </w:p>
+    <w:p>
+      <w:pPr>
+        <w:spacing w:after="0" w:line="360" w:lineRule="auto"/>
+        <w:rPr>
+          <w:b/>
+          <w:bCs/>
+        </w:rPr>
+      </w:pPr>
+      <w:r>
+        <w:rPr>
+          <w:b/>
+          <w:bCs/>
+        </w:rPr>
+        <w:t xml:space="preserve">Word count: 6889 words </w:t>
+      </w:r>
+      <w:r>
+        <w:t>(Introduction: 15</w:t>
+      </w:r>
+      <w:r>
+        <w:t>55</w:t>
+      </w:r>
+      <w:r>
+        <w:t xml:space="preserve"> words, Materials and Methods: </w:t>
+      </w:r>
+      <w:r>
+        <w:t>1955</w:t>
+      </w:r>
+      <w:r>
+        <w:t xml:space="preserve"> words, Results: 10</w:t>
+      </w:r>
+      <w:r>
+        <w:t>91</w:t>
+      </w:r>
+      <w:r>
+        <w:t xml:space="preserve"> words, Discussion: </w:t>
+      </w:r>
+      <w:r>
+        <w:t>2288</w:t>
+      </w:r>
+      <w:r>
+        <w:t xml:space="preserve"> words)</w:t>
+      </w:r>
+    </w:p>
+    <w:p>
+      <w:pPr>
+        <w:spacing w:after="0" w:line="360" w:lineRule="auto"/>
+        <w:rPr>
+          <w:b/>
+          <w:bCs/>
+          <w:sz w:val="12"/>
+          <w:szCs w:val="12"/>
+        </w:rPr>
+      </w:pPr>
+    </w:p>
+    <w:p>
+      <w:pPr>
+        <w:spacing w:after="0" w:line="360" w:lineRule="auto"/>
+        <w:rPr>
+          <w:b/>
+          <w:bCs/>
+        </w:rPr>
+      </w:pPr>
+      <w:r>
+        <w:rPr>
+          <w:b/>
+          <w:bCs/>
+        </w:rPr>
+        <w:t>Display Items</w:t>
+      </w:r>
+    </w:p>
+    <w:p>
+      <w:pPr>
+        <w:spacing w:after="0" w:line="360" w:lineRule="auto"/>
+        <w:rPr>
+          <w:b/>
+          <w:bCs/>
+        </w:rPr>
+      </w:pPr>
+      <w:r>
+        <w:t>Tables: 1</w:t>
+      </w:r>
+    </w:p>
+    <w:p>
+      <w:pPr>
+        <w:spacing w:after="0" w:line="360" w:lineRule="auto"/>
+      </w:pPr>
+      <w:r>
+        <w:t xml:space="preserve">Figures: </w:t>
+      </w:r>
+      <w:r>
+        <w:t>6</w:t>
+      </w:r>
+    </w:p>
+    <w:p>
+      <w:pPr>
+        <w:spacing w:after="0" w:line="360" w:lineRule="auto"/>
+      </w:pPr>
+      <w:r>
+        <w:t>Supplemental Tables: 14</w:t>
+      </w:r>
+    </w:p>
+    <w:p>
+      <w:pPr>
+        <w:spacing w:after="0" w:line="360" w:lineRule="auto"/>
+      </w:pPr>
+      <w:r>
+        <w:t>Supplemental Figures:</w:t>
+      </w:r>
+      <w:r>
+        <w:t xml:space="preserve"> 18</w:t>
+      </w:r>
+    </w:p>
+    <w:p>
+      <w:pPr>
+        <w:spacing w:after="0" w:line="240" w:lineRule="auto"/>
+        <w:rPr>
+          <w:rFonts w:eastAsia="Times New Roman"/>
+          <w:kern w:val="0"/>
+          <w14:ligatures w14:val="none"/>
+        </w:rPr>
+      </w:pPr>
+    </w:p>
+    <w:p>
+      <w:pPr>
+        <w:spacing w:after="0" w:line="360" w:lineRule="auto"/>
+        <w:rPr>
+          <w:rFonts w:eastAsia="Times New Roman"/>
+          <w:b/>
+          <w:bCs/>
+          <w:kern w:val="0"/>
+          <w14:ligatures w14:val="none"/>
+        </w:rPr>
+      </w:pPr>
+      <w:r>
+        <w:rPr>
+          <w:rFonts w:eastAsia="Times New Roman"/>
+          <w:b/>
+          <w:bCs/>
+          <w:kern w:val="0"/>
+          <w14:ligatures w14:val="none"/>
+        </w:rPr>
+        <w:lastRenderedPageBreak/>
+        <w:t>Authorship Statement</w:t>
+      </w:r>
+    </w:p>
+    <w:p>
+      <w:pPr>
+        <w:spacing w:line="360" w:lineRule="auto"/>
+      </w:pPr>
+      <w:r>
+        <w:t xml:space="preserve">All authors conceptualized the study. EAP carried out data collection, conducted the formal analysis, and wrote the original draft. NGS, SPH, ICP, BDS, KTR, and </w:t>
+      </w:r>
+      <w:proofErr w:type="spellStart"/>
+      <w:r>
+        <w:t>HJdB</w:t>
+      </w:r>
+      <w:proofErr w:type="spellEnd"/>
+      <w:r>
+        <w:t xml:space="preserve"> acquired funding, while NGS, SPH, ICP, and BDS led project administration and oversaw the investigation progress. All authors contributed to reviewing and editing the manuscript. All authors support the manuscript’s submission to </w:t>
+      </w:r>
+      <w:r>
+        <w:rPr>
+          <w:i/>
+          <w:iCs/>
+        </w:rPr>
+        <w:t>Ecology Letters</w:t>
+      </w:r>
+      <w:r>
+        <w:t>.</w:t>
+      </w:r>
+    </w:p>
+    <w:p>
+      <w:pPr>
+        <w:spacing w:line="360" w:lineRule="auto"/>
+      </w:pPr>
+      <w:r>
+        <w:rPr>
+          <w:b/>
+          <w:bCs/>
+        </w:rPr>
+        <w:t xml:space="preserve">Data </w:t>
+      </w:r>
+      <w:r>
+        <w:rPr>
+          <w:b/>
+          <w:bCs/>
+        </w:rPr>
+        <w:t>Statement</w:t>
+      </w:r>
+      <w:r>
+        <w:rPr>
+          <w:b/>
+          <w:bCs/>
+        </w:rPr>
+        <w:t>:</w:t>
+      </w:r>
+      <w:r>
+        <w:t xml:space="preserve"> All data and code are available on </w:t>
+      </w:r>
+      <w:proofErr w:type="spellStart"/>
+      <w:r>
+        <w:t>Zenodo</w:t>
+      </w:r>
+      <w:proofErr w:type="spellEnd"/>
+      <w:r>
+        <w:t xml:space="preserve"> (DOI: </w:t>
+      </w:r>
+      <w:hyperlink r:id="rId7">
+        <w:r>
+          <w:rPr>
+            <w:color w:val="1155CC"/>
+            <w:u w:val="single"/>
+          </w:rPr>
+          <w:t>10.5281/zenodo.19959825</w:t>
+        </w:r>
+      </w:hyperlink>
+      <w:r>
+        <w:t>).</w:t>
       </w:r>
     </w:p>
     <w:sectPr>

</xml_diff>